<commit_message>
Docs: changelog, methodology manual, deployment with the pending migrations, the assessment register
Co-Authored-By: Claude Fable 5.1 <noreply@anthropic.com>
</commit_message>
<xml_diff>
--- a/docs/HAZARD_ADVANCEMENT_PAPER.docx
+++ b/docs/HAZARD_ADVANCEMENT_PAPER.docx
@@ -23,604 +23,64 @@
         <w:pStyle w:val="Date"/>
       </w:pPr>
       <w:r>
-        <w:t xml:space="preserve">2026-06-03</w:t>
-      </w:r>
-    </w:p>
-    <w:sdt>
-      <w:sdtPr>
-        <w:docPartObj>
-          <w:docPartGallery w:val="Table of Contents"/>
-          <w:docPartUnique/>
-        </w:docPartObj>
-      </w:sdtPr>
-      <w:sdtContent>
-        <w:p>
-          <w:pPr>
-            <w:pStyle w:val="TOCHeading"/>
-          </w:pPr>
-          <w:r>
-            <w:t xml:space="preserve">Table of Contents</w:t>
-          </w:r>
-        </w:p>
-        <w:p>
-          <w:r>
-            <w:fldChar w:fldCharType="begin" w:dirty="true"/>
-            <w:instrText xml:space="preserve">TOC \o "1-2" \h \z \u</w:instrText>
-            <w:fldChar w:fldCharType="separate"/>
-            <w:fldChar w:fldCharType="end"/>
-          </w:r>
-        </w:p>
-      </w:sdtContent>
-    </w:sdt>
-    <w:p>
-      <w:pPr>
-        <w:pStyle w:val="BlockText"/>
-      </w:pPr>
-      <w:r>
-        <w:rPr>
-          <w:b/>
-          <w:bCs/>
-        </w:rPr>
-        <w:t xml:space="preserve">Status - proposal for INFORM Calc Engine v2.</w:t>
-      </w:r>
-      <w:r>
-        <w:t xml:space="preserve"> </w:t>
-      </w:r>
-      <w:r>
-        <w:t xml:space="preserve">The operational model (</w:t>
-      </w:r>
-      <w:r>
-        <w:rPr>
-          <w:b/>
-          <w:bCs/>
-        </w:rPr>
-        <w:t xml:space="preserve">v1</w:t>
-      </w:r>
-      <w:r>
-        <w:t xml:space="preserve">) keeps the INFORM</w:t>
-      </w:r>
-      <w:r>
-        <w:t xml:space="preserve"> </w:t>
-      </w:r>
-      <w:r>
-        <w:t xml:space="preserve">aggregation engine</w:t>
-      </w:r>
-      <w:r>
-        <w:t xml:space="preserve"> </w:t>
-      </w:r>
-      <w:r>
-        <w:rPr>
-          <w:b/>
-          <w:bCs/>
-        </w:rPr>
-        <w:t xml:space="preserve">exactly</w:t>
-      </w:r>
-      <w:r>
-        <w:t xml:space="preserve"> </w:t>
-      </w:r>
-      <w:r>
-        <w:t xml:space="preserve">as the official Excel workbook - verified formula-by-formula, written in</w:t>
-      </w:r>
-      <w:r>
-        <w:t xml:space="preserve"> </w:t>
-      </w:r>
-      <w:r>
-        <w:t xml:space="preserve">the code in the workbook’s own literal form (product</w:t>
-      </w:r>
-      <w:r>
-        <w:t xml:space="preserve"> </w:t>
-      </w:r>
-      <w:r>
-        <w:rPr>
-          <w:rStyle w:val="VerbatimChar"/>
-        </w:rPr>
-        <w:t xml:space="preserve">GEOMEAN</w:t>
-      </w:r>
-      <w:r>
-        <w:t xml:space="preserve">, product of cube roots,</w:t>
-      </w:r>
-      <w:r>
-        <w:t xml:space="preserve"> </w:t>
-      </w:r>
-      <w:r>
-        <w:rPr>
-          <w:rStyle w:val="VerbatimChar"/>
-        </w:rPr>
-        <w:t xml:space="preserve">AVERAGE</w:t>
-      </w:r>
-      <w:r>
-        <w:t xml:space="preserve">,</w:t>
-      </w:r>
-      <w:r>
-        <w:t xml:space="preserve"> </w:t>
-      </w:r>
-      <w:r>
-        <w:t xml:space="preserve">min-max). The advancements documented in this paper are a</w:t>
-      </w:r>
-      <w:r>
-        <w:t xml:space="preserve"> </w:t>
-      </w:r>
-      <w:r>
-        <w:rPr>
-          <w:b/>
-          <w:bCs/>
-        </w:rPr>
-        <w:t xml:space="preserve">proposal</w:t>
-      </w:r>
-      <w:r>
-        <w:t xml:space="preserve">; once validated (</w:t>
-      </w:r>
-      <w:r>
-        <w:t xml:space="preserve">“when it</w:t>
-      </w:r>
-      <w:r>
-        <w:t xml:space="preserve"> </w:t>
-      </w:r>
-      <w:r>
-        <w:t xml:space="preserve">passes”</w:t>
-      </w:r>
-      <w:r>
-        <w:t xml:space="preserve">) they are implemented as</w:t>
-      </w:r>
-      <w:r>
-        <w:t xml:space="preserve"> </w:t>
-      </w:r>
-      <w:r>
-        <w:rPr>
-          <w:b/>
-          <w:bCs/>
-        </w:rPr>
-        <w:t xml:space="preserve">INFORM Calc Engine v2</w:t>
-      </w:r>
-      <w:r>
-        <w:t xml:space="preserve">. In short:</w:t>
-      </w:r>
-      <w:r>
-        <w:t xml:space="preserve"> </w:t>
-      </w:r>
-      <w:r>
-        <w:rPr>
-          <w:b/>
-          <w:bCs/>
-        </w:rPr>
-        <w:t xml:space="preserve">v1 = exact INFORM now; v2 =</w:t>
-      </w:r>
-      <w:r>
-        <w:rPr>
-          <w:b/>
-          <w:bCs/>
-        </w:rPr>
-        <w:t xml:space="preserve"> </w:t>
-      </w:r>
-      <w:r>
-        <w:rPr>
-          <w:b/>
-          <w:bCs/>
-        </w:rPr>
-        <w:t xml:space="preserve">these advancements next</w:t>
-      </w:r>
-      <w:r>
-        <w:t xml:space="preserve">. This is one of three documents - (1) the operational</w:t>
-      </w:r>
-      <w:r>
-        <w:t xml:space="preserve"> </w:t>
-      </w:r>
-      <w:r>
-        <w:rPr>
-          <w:b/>
-          <w:bCs/>
-        </w:rPr>
-        <w:t xml:space="preserve">Manual</w:t>
-      </w:r>
-      <w:r>
-        <w:t xml:space="preserve">, (2) the</w:t>
-      </w:r>
-      <w:r>
-        <w:t xml:space="preserve"> </w:t>
-      </w:r>
-      <w:r>
-        <w:rPr>
-          <w:b/>
-          <w:bCs/>
-        </w:rPr>
-        <w:t xml:space="preserve">Exact-formula reference</w:t>
-      </w:r>
-      <w:r>
-        <w:t xml:space="preserve"> </w:t>
-      </w:r>
-      <w:r>
-        <w:t xml:space="preserve">(</w:t>
-      </w:r>
-      <w:r>
-        <w:rPr>
-          <w:rStyle w:val="VerbatimChar"/>
-        </w:rPr>
-        <w:t xml:space="preserve">INFORM_CALCULATION_ENGINE.docx</w:t>
-      </w:r>
-      <w:r>
-        <w:t xml:space="preserve">, what v1 runs), and (3) this</w:t>
-      </w:r>
-      <w:r>
-        <w:t xml:space="preserve"> </w:t>
-      </w:r>
-      <w:r>
-        <w:rPr>
-          <w:b/>
-          <w:bCs/>
-        </w:rPr>
-        <w:t xml:space="preserve">Paper</w:t>
-      </w:r>
-      <w:r>
-        <w:t xml:space="preserve"> </w:t>
-      </w:r>
-      <w:r>
-        <w:t xml:space="preserve">(the v2 proposal).</w:t>
-      </w:r>
-    </w:p>
-    <w:bookmarkStart w:id="9" w:name="abstract"/>
-    <w:p>
-      <w:pPr>
-        <w:pStyle w:val="Heading1"/>
-      </w:pPr>
-      <w:r>
-        <w:t xml:space="preserve">Abstract</w:t>
+        <w:t xml:space="preserve">2026-06-03, corrected 2026-10-09</w:t>
       </w:r>
     </w:p>
     <w:p>
       <w:pPr>
-        <w:pStyle w:val="FirstParagraph"/>
-      </w:pPr>
-      <w:r>
-        <w:t xml:space="preserve">The INFORM Subnational Risk Index aggregates standardised (0-10) hazard, vulnerability and lack-of-coping</w:t>
-      </w:r>
-      <w:r>
-        <w:t xml:space="preserve"> </w:t>
-      </w:r>
-      <w:r>
-        <w:t xml:space="preserve">indicators into a comparable risk score. Its aggregation</w:t>
-      </w:r>
-      <w:r>
-        <w:t xml:space="preserve"> </w:t>
-      </w:r>
-      <w:r>
-        <w:rPr>
-          <w:b/>
-          <w:bCs/>
-        </w:rPr>
-        <w:t xml:space="preserve">engine</w:t>
-      </w:r>
-      <w:r>
-        <w:t xml:space="preserve"> </w:t>
-      </w:r>
-      <w:r>
-        <w:t xml:space="preserve">- min-max standardisation (with</w:t>
-      </w:r>
-      <w:r>
-        <w:t xml:space="preserve"> </w:t>
-      </w:r>
-      <w:r>
-        <w:t xml:space="preserve">logarithmic transformation and Tukey outlier capping), arithmetic averaging of indicators into categories,</w:t>
-      </w:r>
-      <w:r>
-        <w:t xml:space="preserve"> </w:t>
-      </w:r>
-      <w:r>
-        <w:t xml:space="preserve">the</w:t>
-      </w:r>
-      <w:r>
-        <w:t xml:space="preserve"> </w:t>
-      </w:r>
-      <w:r>
-        <w:rPr>
-          <w:b/>
-          <w:bCs/>
-        </w:rPr>
-        <w:t xml:space="preserve">scaled geometric mean</w:t>
-      </w:r>
-      <w:r>
-        <w:t xml:space="preserve"> </w:t>
-      </w:r>
-      <w:r>
-        <w:t xml:space="preserve">of categories into dimensions, and the</w:t>
-      </w:r>
-      <w:r>
-        <w:t xml:space="preserve"> </w:t>
-      </w:r>
-      <w:r>
-        <w:rPr>
-          <w:b/>
-          <w:bCs/>
-        </w:rPr>
-        <w:t xml:space="preserve">cube root</w:t>
-      </w:r>
-      <w:r>
-        <w:t xml:space="preserve"> </w:t>
-      </w:r>
-      <w:r>
-        <w:t xml:space="preserve">of the three dimensions</w:t>
-      </w:r>
-      <w:r>
-        <w:t xml:space="preserve"> </w:t>
-      </w:r>
-      <w:r>
-        <w:t xml:space="preserve">into risk - is a fixed methodology we</w:t>
-      </w:r>
-      <w:r>
-        <w:t xml:space="preserve"> </w:t>
-      </w:r>
-      <w:r>
-        <w:rPr>
-          <w:b/>
-          <w:bCs/>
-        </w:rPr>
-        <w:t xml:space="preserve">preserve exactly</w:t>
-      </w:r>
-      <w:r>
-        <w:t xml:space="preserve"> </w:t>
-      </w:r>
-      <w:r>
-        <w:t xml:space="preserve">as implemented in the official</w:t>
-      </w:r>
-      <w:r>
-        <w:t xml:space="preserve"> </w:t>
-      </w:r>
-      <w:r>
-        <w:rPr>
-          <w:i/>
-          <w:iCs/>
-        </w:rPr>
-        <w:t xml:space="preserve">Tanzania - Country Model Template</w:t>
-      </w:r>
-      <w:r>
-        <w:t xml:space="preserve"> </w:t>
-      </w:r>
-      <w:r>
-        <w:t xml:space="preserve">workbook (verified formula-by-formula from its hidden sheets). What we</w:t>
-      </w:r>
-      <w:r>
-        <w:t xml:space="preserve"> </w:t>
-      </w:r>
-      <w:r>
-        <w:rPr>
-          <w:b/>
-          <w:bCs/>
-        </w:rPr>
-        <w:t xml:space="preserve">advance</w:t>
-      </w:r>
-      <w:r>
-        <w:t xml:space="preserve"> </w:t>
-      </w:r>
-      <w:r>
-        <w:t xml:space="preserve">is the</w:t>
-      </w:r>
-      <w:r>
-        <w:t xml:space="preserve"> </w:t>
-      </w:r>
-      <w:r>
-        <w:rPr>
-          <w:i/>
-          <w:iCs/>
-        </w:rPr>
-        <w:t xml:space="preserve">evidence</w:t>
-      </w:r>
-      <w:r>
-        <w:t xml:space="preserve"> </w:t>
-      </w:r>
-      <w:r>
-        <w:t xml:space="preserve">behind individual hazard indicators where authoritative national data exist.</w:t>
-      </w:r>
-      <w:r>
-        <w:t xml:space="preserve"> </w:t>
-      </w:r>
-      <w:r>
-        <w:t xml:space="preserve">This paper documents the advancement of the</w:t>
-      </w:r>
-      <w:r>
-        <w:t xml:space="preserve"> </w:t>
-      </w:r>
-      <w:r>
-        <w:rPr>
-          <w:b/>
-          <w:bCs/>
-        </w:rPr>
-        <w:t xml:space="preserve">drought hazard</w:t>
-      </w:r>
-      <w:r>
-        <w:t xml:space="preserve"> </w:t>
-      </w:r>
-      <w:r>
-        <w:t xml:space="preserve">from a coarse INFORM SADC value to a</w:t>
-      </w:r>
-      <w:r>
-        <w:t xml:space="preserve"> </w:t>
-      </w:r>
-      <w:r>
-        <w:t xml:space="preserve">transparent four-component index computed from CHIRPS v3 rainfall (1991-2024) and ERA5 temperature -</w:t>
-      </w:r>
-      <w:r>
-        <w:t xml:space="preserve"> </w:t>
-      </w:r>
-      <w:r>
-        <w:t xml:space="preserve">aridity, interannual variability, SPEI drought depth, and growing-season failure - together with the</w:t>
-      </w:r>
-      <w:r>
-        <w:t xml:space="preserve"> </w:t>
-      </w:r>
-      <w:r>
-        <w:rPr>
-          <w:b/>
-          <w:bCs/>
-        </w:rPr>
-        <w:t xml:space="preserve">initial vs advanced</w:t>
-      </w:r>
-      <w:r>
-        <w:t xml:space="preserve"> </w:t>
-      </w:r>
-      <w:r>
-        <w:t xml:space="preserve">comparison, the</w:t>
-      </w:r>
-      <w:r>
-        <w:t xml:space="preserve"> </w:t>
-      </w:r>
-      <w:r>
-        <w:rPr>
-          <w:b/>
-          <w:bCs/>
-        </w:rPr>
-        <w:t xml:space="preserve">impact</w:t>
-      </w:r>
-      <w:r>
-        <w:t xml:space="preserve">, and the</w:t>
-      </w:r>
-      <w:r>
-        <w:t xml:space="preserve"> </w:t>
-      </w:r>
-      <w:r>
-        <w:rPr>
-          <w:b/>
-          <w:bCs/>
-        </w:rPr>
-        <w:t xml:space="preserve">gap</w:t>
-      </w:r>
-      <w:r>
-        <w:t xml:space="preserve"> </w:t>
-      </w:r>
-      <w:r>
-        <w:t xml:space="preserve">the advancement closes. We show the</w:t>
-      </w:r>
-      <w:r>
-        <w:t xml:space="preserve"> </w:t>
-      </w:r>
-      <w:r>
-        <w:t xml:space="preserve">initial drought layer was spatially incoherent (the central semi-arid zone under-rated at ~4/10, a coastal</w:t>
-      </w:r>
-      <w:r>
-        <w:t xml:space="preserve"> </w:t>
-      </w:r>
-      <w:r>
-        <w:t xml:space="preserve">city over-rated at 10/10), whereas the advanced layer tracks observed rainfall and the food-security</w:t>
-      </w:r>
-      <w:r>
-        <w:t xml:space="preserve"> </w:t>
-      </w:r>
-      <w:r>
-        <w:t xml:space="preserve">geography. The flood, heatwave and exposure advancements are summarised. Finally we open a</w:t>
-      </w:r>
-      <w:r>
-        <w:t xml:space="preserve"> </w:t>
-      </w:r>
-      <w:r>
-        <w:rPr>
-          <w:b/>
-          <w:bCs/>
-        </w:rPr>
-        <w:t xml:space="preserve">living, four-tier v2</w:t>
-      </w:r>
-      <w:r>
-        <w:rPr>
-          <w:b/>
-          <w:bCs/>
-        </w:rPr>
-        <w:t xml:space="preserve"> </w:t>
-      </w:r>
-      <w:r>
-        <w:rPr>
-          <w:b/>
-          <w:bCs/>
-        </w:rPr>
-        <w:t xml:space="preserve">issue register</w:t>
-      </w:r>
-      <w:r>
-        <w:t xml:space="preserve"> </w:t>
-      </w:r>
-      <w:r>
-        <w:t xml:space="preserve">(Section 8) - engine-fidelity, hazard-evidence, exposure/vulnerability resolution, and</w:t>
-      </w:r>
-      <w:r>
-        <w:t xml:space="preserve"> </w:t>
-      </w:r>
-      <w:r>
-        <w:t xml:space="preserve">validation - and the three cross-cutting insights (stable references, hazard-specific exposure, outcome</w:t>
-      </w:r>
-      <w:r>
-        <w:t xml:space="preserve"> </w:t>
-      </w:r>
-      <w:r>
-        <w:t xml:space="preserve">validation) that anchor it (Section 9). Every item is a proposal for a future, separately-validated INFORM</w:t>
-      </w:r>
-      <w:r>
-        <w:t xml:space="preserve"> </w:t>
-      </w:r>
-      <w:r>
-        <w:t xml:space="preserve">Calc Engine v2; none changes the v1 engine running today.</w:t>
-      </w:r>
-    </w:p>
-    <w:bookmarkEnd w:id="9"/>
-    <w:bookmarkStart w:id="10" w:name="introduction"/>
-    <w:p>
-      <w:pPr>
-        <w:pStyle w:val="Heading1"/>
-      </w:pPr>
-      <w:r>
-        <w:t xml:space="preserve">1. Introduction</w:t>
-      </w:r>
-    </w:p>
-    <w:p>
-      <w:pPr>
-        <w:pStyle w:val="FirstParagraph"/>
-      </w:pPr>
-      <w:r>
-        <w:t xml:space="preserve">INFORM (the Index for Risk Management; DRMKC/JRC, European Commission) provides a transparent, reproducible</w:t>
-      </w:r>
-      <w:r>
-        <w:t xml:space="preserve"> </w:t>
-      </w:r>
-      <w:r>
-        <w:t xml:space="preserve">composite risk model [1]. For Tanzania, the operational instrument is the</w:t>
-      </w:r>
-      <w:r>
-        <w:t xml:space="preserve"> </w:t>
-      </w:r>
-      <w:r>
-        <w:rPr>
-          <w:i/>
-          <w:iCs/>
-        </w:rPr>
-        <w:t xml:space="preserve">Tanzania - Country Model</w:t>
-      </w:r>
-      <w:r>
-        <w:rPr>
-          <w:i/>
-          <w:iCs/>
-        </w:rPr>
-        <w:t xml:space="preserve"> </w:t>
-      </w:r>
-      <w:r>
-        <w:rPr>
-          <w:i/>
-          <w:iCs/>
-        </w:rPr>
-        <w:t xml:space="preserve">Template</w:t>
-      </w:r>
-      <w:r>
-        <w:t xml:space="preserve"> </w:t>
-      </w:r>
-      <w:r>
-        <w:t xml:space="preserve">workbook, whose engine standardises each indicator to 0-10 and aggregates them. The engine is</w:t>
-      </w:r>
-      <w:r>
-        <w:t xml:space="preserve"> </w:t>
-      </w:r>
-      <w:r>
-        <w:t xml:space="preserve">deliberately conservative and globally comparable; it must not be silently altered.</w:t>
-      </w:r>
-    </w:p>
-    <w:p>
-      <w:pPr>
-        <w:pStyle w:val="BodyText"/>
-      </w:pPr>
-      <w:r>
-        <w:t xml:space="preserve">Our work separates two concerns:</w:t>
+        <w:pStyle w:val="BlockText"/>
+      </w:pPr>
+      <w:r>
+        <w:rPr>
+          <w:b/>
+          <w:bCs/>
+        </w:rPr>
+        <w:t xml:space="preserve">Status, corrected 9 October 2026.</w:t>
+      </w:r>
+      <w:r>
+        <w:t xml:space="preserve"> </w:t>
+      </w:r>
+      <w:r>
+        <w:t xml:space="preserve">This paper (June 2026) proposed advancing the hazard evidence</w:t>
+      </w:r>
+      <w:r>
+        <w:t xml:space="preserve"> </w:t>
+      </w:r>
+      <w:r>
+        <w:t xml:space="preserve">under a</w:t>
+      </w:r>
+      <w:r>
+        <w:t xml:space="preserve"> </w:t>
+      </w:r>
+      <w:r>
+        <w:t xml:space="preserve">“raise-only”</w:t>
+      </w:r>
+      <w:r>
+        <w:t xml:space="preserve"> </w:t>
+      </w:r>
+      <w:r>
+        <w:t xml:space="preserve">rule and quoted national figures from the working dataset. The integrity</w:t>
+      </w:r>
+      <w:r>
+        <w:t xml:space="preserve"> </w:t>
+      </w:r>
+      <w:r>
+        <w:t xml:space="preserve">assessment of October 2026 (</w:t>
+      </w:r>
+      <w:r>
+        <w:rPr>
+          <w:rStyle w:val="VerbatimChar"/>
+        </w:rPr>
+        <w:t xml:space="preserve">docs/assessment/INFORM_TZ_Integrity_Assessment_2026-10.md</w:t>
+      </w:r>
+      <w:r>
+        <w:t xml:space="preserve">) superseded</w:t>
+      </w:r>
+      <w:r>
+        <w:t xml:space="preserve"> </w:t>
+      </w:r>
+      <w:r>
+        <w:t xml:space="preserve">both, and the corrections are recorded here so that no copy of this paper circulates without them:</w:t>
       </w:r>
     </w:p>
     <w:p>
@@ -636,141 +96,63 @@
           <w:b/>
           <w:bCs/>
         </w:rPr>
-        <w:t xml:space="preserve">The engine</w:t>
-      </w:r>
-      <w:r>
-        <w:t xml:space="preserve"> </w:t>
-      </w:r>
-      <w:r>
-        <w:t xml:space="preserve">(how numbers combine). This stays</w:t>
-      </w:r>
-      <w:r>
-        <w:t xml:space="preserve"> </w:t>
-      </w:r>
-      <w:r>
-        <w:rPr>
-          <w:b/>
-          <w:bCs/>
-        </w:rPr>
-        <w:t xml:space="preserve">identical</w:t>
-      </w:r>
-      <w:r>
-        <w:t xml:space="preserve"> </w:t>
-      </w:r>
-      <w:r>
-        <w:t xml:space="preserve">to the workbook - we verified every</w:t>
-      </w:r>
-      <w:r>
-        <w:t xml:space="preserve"> </w:t>
-      </w:r>
-      <w:r>
-        <w:t xml:space="preserve">formula directly from the (hidden) engine sheets (see the companion</w:t>
-      </w:r>
-      <w:r>
-        <w:t xml:space="preserve"> </w:t>
-      </w:r>
-      <w:r>
-        <w:rPr>
-          <w:rStyle w:val="VerbatimChar"/>
-        </w:rPr>
-        <w:t xml:space="preserve">INFORM_CALCULATION_ENGINE.docx</w:t>
-      </w:r>
-      <w:r>
-        <w:t xml:space="preserve">):</w:t>
-      </w:r>
-      <w:r>
-        <w:t xml:space="preserve"> </w:t>
-      </w:r>
-      <w:r>
-        <w:t xml:space="preserve">component =</w:t>
-      </w:r>
-      <w:r>
-        <w:t xml:space="preserve"> </w:t>
-      </w:r>
-      <w:r>
-        <w:rPr>
-          <w:rStyle w:val="VerbatimChar"/>
-        </w:rPr>
-        <w:t xml:space="preserve">AVERAGE</w:t>
-      </w:r>
-      <w:r>
-        <w:t xml:space="preserve">, category =</w:t>
-      </w:r>
-      <w:r>
-        <w:t xml:space="preserve"> </w:t>
-      </w:r>
-      <w:r>
-        <w:rPr>
-          <w:rStyle w:val="VerbatimChar"/>
-        </w:rPr>
-        <w:t xml:space="preserve">AVERAGE</w:t>
-      </w:r>
-      <w:r>
-        <w:t xml:space="preserve">, dimension =</w:t>
-      </w:r>
-      <w:r>
-        <w:t xml:space="preserve"> </w:t>
-      </w:r>
-      <w:r>
-        <w:rPr>
-          <w:rStyle w:val="VerbatimChar"/>
-        </w:rPr>
-        <w:t xml:space="preserve">ROUND((10-GEOMEAN((10-c)/10*9+1...))/9*10,1)</w:t>
-      </w:r>
-      <w:r>
-        <w:t xml:space="preserve"> </w:t>
-      </w:r>
-      <w:r>
-        <w:t xml:space="preserve">(scaled geometric mean), risk =</w:t>
-      </w:r>
-      <w:r>
-        <w:t xml:space="preserve"> </w:t>
-      </w:r>
-      <w:r>
-        <w:rPr>
-          <w:rStyle w:val="VerbatimChar"/>
-        </w:rPr>
-        <w:t xml:space="preserve">ROUND(H^(1/3)*V^(1/3)*LCC^(1/3),1)</w:t>
-      </w:r>
-      <w:r>
-        <w:t xml:space="preserve"> </w:t>
-      </w:r>
-      <w:r>
-        <w:t xml:space="preserve">(cube root), and standardisation =</w:t>
-      </w:r>
-      <w:r>
-        <w:t xml:space="preserve"> </w:t>
-      </w:r>
-      <w:r>
-        <w:t xml:space="preserve">min-max to 0-10 with optional log/exp transform, Tukey (Q1-1.5</w:t>
-      </w:r>
-      <w:r>
-        <w:rPr>
-          <w:i/>
-          <w:iCs/>
-        </w:rPr>
-        <w:t xml:space="preserve">IQR, Q3+1.5</w:t>
-      </w:r>
-      <w:r>
-        <w:t xml:space="preserve">IQR) outlier capping, and an</w:t>
-      </w:r>
-      <w:r>
-        <w:t xml:space="preserve"> </w:t>
-      </w:r>
-      <w:r>
-        <w:t xml:space="preserve">inversion for</w:t>
-      </w:r>
-      <w:r>
-        <w:t xml:space="preserve"> </w:t>
-      </w:r>
-      <w:r>
-        <w:t xml:space="preserve">“Decrease Risk”</w:t>
-      </w:r>
-      <w:r>
-        <w:t xml:space="preserve"> </w:t>
-      </w:r>
-      <w:r>
-        <w:t xml:space="preserve">indicators.</w:t>
+        <w:t xml:space="preserve">The national figures in Section 2</w:t>
+      </w:r>
+      <w:r>
+        <w:t xml:space="preserve"> </w:t>
+      </w:r>
+      <w:r>
+        <w:t xml:space="preserve">(Hazard 2.2, Vulnerability 5.5, Lack-of-Coping 5.9, Risk 4.1)</w:t>
+      </w:r>
+      <w:r>
+        <w:t xml:space="preserve"> </w:t>
+      </w:r>
+      <w:r>
+        <w:t xml:space="preserve">were the</w:t>
+      </w:r>
+      <w:r>
+        <w:t xml:space="preserve"> </w:t>
+      </w:r>
+      <w:r>
+        <w:rPr>
+          <w:b/>
+          <w:bCs/>
+        </w:rPr>
+        <w:t xml:space="preserve">Kondoa district row</w:t>
+      </w:r>
+      <w:r>
+        <w:t xml:space="preserve"> </w:t>
+      </w:r>
+      <w:r>
+        <w:t xml:space="preserve">of the workbook, not a national value. The INFORM aggregate of the</w:t>
+      </w:r>
+      <w:r>
+        <w:t xml:space="preserve"> </w:t>
+      </w:r>
+      <w:r>
+        <w:t xml:space="preserve">195 councils on the workbook data is</w:t>
+      </w:r>
+      <w:r>
+        <w:t xml:space="preserve"> </w:t>
+      </w:r>
+      <w:r>
+        <w:rPr>
+          <w:b/>
+          <w:bCs/>
+        </w:rPr>
+        <w:t xml:space="preserve">3.8</w:t>
+      </w:r>
+      <w:r>
+        <w:t xml:space="preserve"> </w:t>
+      </w:r>
+      <w:r>
+        <w:t xml:space="preserve">(Hazard &amp; Exposure 2.4, Vulnerability 3.8, Lack of</w:t>
+      </w:r>
+      <w:r>
+        <w:t xml:space="preserve"> </w:t>
+      </w:r>
+      <w:r>
+        <w:t xml:space="preserve">Coping Capacity 6.2), and INFORM publishes no official national figure for a subnational model.</w:t>
       </w:r>
     </w:p>
     <w:p>
@@ -786,164 +168,491 @@
           <w:b/>
           <w:bCs/>
         </w:rPr>
-        <w:t xml:space="preserve">The evidence</w:t>
-      </w:r>
-      <w:r>
-        <w:t xml:space="preserve"> </w:t>
-      </w:r>
-      <w:r>
-        <w:t xml:space="preserve">(the value of each indicator). Where the INFORM SADC layer is coarse, dated, or</w:t>
-      </w:r>
-      <w:r>
-        <w:t xml:space="preserve"> </w:t>
-      </w:r>
-      <w:r>
-        <w:t xml:space="preserve">incoherent for Tanzania, and authoritative national data exist, we</w:t>
-      </w:r>
-      <w:r>
-        <w:t xml:space="preserve"> </w:t>
-      </w:r>
-      <w:r>
-        <w:rPr>
-          <w:b/>
-          <w:bCs/>
-        </w:rPr>
-        <w:t xml:space="preserve">recompute the indicator</w:t>
-      </w:r>
-      <w:r>
-        <w:t xml:space="preserve"> </w:t>
-      </w:r>
-      <w:r>
-        <w:t xml:space="preserve">from</w:t>
-      </w:r>
-      <w:r>
-        <w:t xml:space="preserve"> </w:t>
-      </w:r>
-      <w:r>
-        <w:t xml:space="preserve">primary data using the</w:t>
-      </w:r>
-      <w:r>
-        <w:t xml:space="preserve"> </w:t>
-      </w:r>
-      <w:r>
-        <w:rPr>
-          <w:b/>
-          <w:bCs/>
-        </w:rPr>
-        <w:t xml:space="preserve">same standardisation method</w:t>
-      </w:r>
-      <w:r>
-        <w:t xml:space="preserve"> </w:t>
-      </w:r>
-      <w:r>
-        <w:t xml:space="preserve">the engine prescribes, and we apply it</w:t>
-      </w:r>
-      <w:r>
-        <w:t xml:space="preserve"> </w:t>
-      </w:r>
-      <w:r>
-        <w:rPr>
-          <w:b/>
-          <w:bCs/>
-        </w:rPr>
-        <w:t xml:space="preserve">raise-only</w:t>
-      </w:r>
-      <w:r>
-        <w:t xml:space="preserve"> </w:t>
-      </w:r>
-      <w:r>
-        <w:t xml:space="preserve">(the computed value may raise a documented hazard but never silently lower it).</w:t>
+        <w:t xml:space="preserve">Raise-only is withdrawn.</w:t>
+      </w:r>
+      <w:r>
+        <w:t xml:space="preserve"> </w:t>
+      </w:r>
+      <w:r>
+        <w:t xml:space="preserve">The Core carries the workbook values exactly (built by</w:t>
+      </w:r>
+      <w:r>
+        <w:t xml:space="preserve"> </w:t>
+      </w:r>
+      <w:r>
+        <w:rPr>
+          <w:rStyle w:val="VerbatimChar"/>
+        </w:rPr>
+        <w:t xml:space="preserve">scripts/build-core.mjs</w:t>
+      </w:r>
+      <w:r>
+        <w:t xml:space="preserve">, reproduced at 8,664/8,664 standardised values and 170/170 risks). Earth</w:t>
+      </w:r>
+      <w:r>
+        <w:t xml:space="preserve"> </w:t>
+      </w:r>
+      <w:r>
+        <w:t xml:space="preserve">observation evidence enters a separate</w:t>
+      </w:r>
+      <w:r>
+        <w:t xml:space="preserve"> </w:t>
+      </w:r>
+      <w:r>
+        <w:rPr>
+          <w:b/>
+          <w:bCs/>
+        </w:rPr>
+        <w:t xml:space="preserve">Advancement layer</w:t>
+      </w:r>
+      <w:r>
+        <w:t xml:space="preserve"> </w:t>
+      </w:r>
+      <w:r>
+        <w:t xml:space="preserve">as weighted sub-indicators beside the</w:t>
+      </w:r>
+      <w:r>
+        <w:t xml:space="preserve"> </w:t>
+      </w:r>
+      <w:r>
+        <w:t xml:space="preserve">workbook member of each indicator group, over the members with data, and is shown beside the Core on</w:t>
+      </w:r>
+      <w:r>
+        <w:t xml:space="preserve"> </w:t>
+      </w:r>
+      <w:r>
+        <w:t xml:space="preserve">every profile, never in its place. Nothing floors, raises or lowers a Core value.</w:t>
       </w:r>
     </w:p>
     <w:p>
       <w:pPr>
-        <w:pStyle w:val="FirstParagraph"/>
-      </w:pPr>
-      <w:r>
-        <w:t xml:space="preserve">This paper makes the second concern explicit and auditable, using</w:t>
-      </w:r>
-      <w:r>
-        <w:t xml:space="preserve"> </w:t>
-      </w:r>
-      <w:r>
-        <w:rPr>
-          <w:b/>
-          <w:bCs/>
-        </w:rPr>
-        <w:t xml:space="preserve">drought</w:t>
-      </w:r>
-      <w:r>
-        <w:t xml:space="preserve"> </w:t>
-      </w:r>
-      <w:r>
-        <w:t xml:space="preserve">as the worked case, because</w:t>
-      </w:r>
-      <w:r>
-        <w:t xml:space="preserve"> </w:t>
-      </w:r>
-      <w:r>
-        <w:t xml:space="preserve">drought is the hazard most consequential for Tanzanian food security and the one for which the densest</w:t>
-      </w:r>
-      <w:r>
-        <w:t xml:space="preserve"> </w:t>
-      </w:r>
-      <w:r>
-        <w:t xml:space="preserve">observational record exists.</w:t>
-      </w:r>
-    </w:p>
-    <w:bookmarkEnd w:id="10"/>
-    <w:bookmarkStart w:id="11" w:name="the-preserved-inform-engine"/>
-    <w:p>
-      <w:pPr>
-        <w:pStyle w:val="Heading1"/>
-      </w:pPr>
-      <w:r>
-        <w:t xml:space="preserve">2. The preserved INFORM engine</w:t>
+        <w:pStyle w:val="Compact"/>
+        <w:numPr>
+          <w:ilvl w:val="0"/>
+          <w:numId w:val="1001"/>
+        </w:numPr>
+      </w:pPr>
+      <w:r>
+        <w:rPr>
+          <w:b/>
+          <w:bCs/>
+        </w:rPr>
+        <w:t xml:space="preserve">The blended drought composite of Section 3 is withdrawn.</w:t>
+      </w:r>
+      <w:r>
+        <w:t xml:space="preserve"> </w:t>
+      </w:r>
+      <w:r>
+        <w:t xml:space="preserve">It scored wet highland councils</w:t>
+      </w:r>
+      <w:r>
+        <w:t xml:space="preserve"> </w:t>
+      </w:r>
+      <w:r>
+        <w:t xml:space="preserve">(Lushoto) 10 by selecting the erratic short rains as the main season. Aridity, SPEI depth, rainfall</w:t>
+      </w:r>
+      <w:r>
+        <w:t xml:space="preserve"> </w:t>
+      </w:r>
+      <w:r>
+        <w:t xml:space="preserve">variability, NDVI and soil moisture now enter the Advancement layer as separate members with their</w:t>
+      </w:r>
+      <w:r>
+        <w:t xml:space="preserve"> </w:t>
+      </w:r>
+      <w:r>
+        <w:t xml:space="preserve">sources; the growing-season member is withheld until both rainy seasons are scored (issue MET-01).</w:t>
       </w:r>
     </w:p>
     <w:p>
       <w:pPr>
+        <w:pStyle w:val="Compact"/>
+        <w:numPr>
+          <w:ilvl w:val="0"/>
+          <w:numId w:val="1001"/>
+        </w:numPr>
+      </w:pPr>
+      <w:r>
+        <w:rPr>
+          <w:b/>
+          <w:bCs/>
+        </w:rPr>
+        <w:t xml:space="preserve">The flood = max(H, sqrt(H x E)) rule of Section 6 is removed</w:t>
+      </w:r>
+      <w:r>
+        <w:t xml:space="preserve"> </w:t>
+      </w:r>
+      <w:r>
+        <w:t xml:space="preserve">from the model. Heavy-rainfall</w:t>
+      </w:r>
+      <w:r>
+        <w:t xml:space="preserve"> </w:t>
+      </w:r>
+      <w:r>
+        <w:t xml:space="preserve">frequency enters the Advancement layer; exposure is shown as the 2022 census population, not</w:t>
+      </w:r>
+      <w:r>
+        <w:t xml:space="preserve"> </w:t>
+      </w:r>
+      <w:r>
+        <w:t xml:space="preserve">multiplied into any hazard.</w:t>
+      </w:r>
+    </w:p>
+    <w:p>
+      <w:pPr>
+        <w:pStyle w:val="Compact"/>
+        <w:numPr>
+          <w:ilvl w:val="0"/>
+          <w:numId w:val="1001"/>
+        </w:numPr>
+      </w:pPr>
+      <w:r>
+        <w:rPr>
+          <w:b/>
+          <w:bCs/>
+        </w:rPr>
+        <w:t xml:space="preserve">Earthquake</w:t>
+      </w:r>
+      <w:r>
+        <w:t xml:space="preserve"> </w:t>
+      </w:r>
+      <w:r>
+        <w:t xml:space="preserve">in the Core is the workbook’s GEM exposure index; the USGS catalogue (events within</w:t>
+      </w:r>
+      <w:r>
+        <w:t xml:space="preserve"> </w:t>
+      </w:r>
+      <w:r>
+        <w:t xml:space="preserve">50 km) is an Advancement member, not a Core source.</w:t>
+      </w:r>
+    </w:p>
+    <w:p>
+      <w:pPr>
+        <w:pStyle w:val="BlockText"/>
+      </w:pPr>
+      <w:r>
+        <w:t xml:space="preserve">The Tier 1 engine-fidelity items of Section 8 are closed by the Core rebuild. The body below is kept</w:t>
+      </w:r>
+      <w:r>
+        <w:t xml:space="preserve"> </w:t>
+      </w:r>
+      <w:r>
+        <w:t xml:space="preserve">as the record of the June 2026 proposal; where it states a method no longer used, the status is marked</w:t>
+      </w:r>
+      <w:r>
+        <w:t xml:space="preserve"> </w:t>
+      </w:r>
+      <w:r>
+        <w:t xml:space="preserve">in brackets.</w:t>
+      </w:r>
+    </w:p>
+    <w:p>
+      <w:pPr>
+        <w:pStyle w:val="BlockText"/>
+      </w:pPr>
+      <w:r>
+        <w:rPr>
+          <w:b/>
+          <w:bCs/>
+        </w:rPr>
+        <w:t xml:space="preserve">Original status note (June 2026) - proposal for INFORM Calc Engine v2.</w:t>
+      </w:r>
+      <w:r>
+        <w:t xml:space="preserve"> </w:t>
+      </w:r>
+      <w:r>
+        <w:t xml:space="preserve">The operational model (</w:t>
+      </w:r>
+      <w:r>
+        <w:rPr>
+          <w:b/>
+          <w:bCs/>
+        </w:rPr>
+        <w:t xml:space="preserve">v1</w:t>
+      </w:r>
+      <w:r>
+        <w:t xml:space="preserve">) keeps the INFORM</w:t>
+      </w:r>
+      <w:r>
+        <w:t xml:space="preserve"> </w:t>
+      </w:r>
+      <w:r>
+        <w:t xml:space="preserve">aggregation engine</w:t>
+      </w:r>
+      <w:r>
+        <w:t xml:space="preserve"> </w:t>
+      </w:r>
+      <w:r>
+        <w:rPr>
+          <w:b/>
+          <w:bCs/>
+        </w:rPr>
+        <w:t xml:space="preserve">exactly</w:t>
+      </w:r>
+      <w:r>
+        <w:t xml:space="preserve"> </w:t>
+      </w:r>
+      <w:r>
+        <w:t xml:space="preserve">as the official Excel workbook - verified formula-by-formula, written in</w:t>
+      </w:r>
+      <w:r>
+        <w:t xml:space="preserve"> </w:t>
+      </w:r>
+      <w:r>
+        <w:t xml:space="preserve">the code in the workbook’s own literal form (product</w:t>
+      </w:r>
+      <w:r>
+        <w:t xml:space="preserve"> </w:t>
+      </w:r>
+      <w:r>
+        <w:rPr>
+          <w:rStyle w:val="VerbatimChar"/>
+        </w:rPr>
+        <w:t xml:space="preserve">GEOMEAN</w:t>
+      </w:r>
+      <w:r>
+        <w:t xml:space="preserve">, product of cube roots,</w:t>
+      </w:r>
+      <w:r>
+        <w:t xml:space="preserve"> </w:t>
+      </w:r>
+      <w:r>
+        <w:rPr>
+          <w:rStyle w:val="VerbatimChar"/>
+        </w:rPr>
+        <w:t xml:space="preserve">AVERAGE</w:t>
+      </w:r>
+      <w:r>
+        <w:t xml:space="preserve">,</w:t>
+      </w:r>
+      <w:r>
+        <w:t xml:space="preserve"> </w:t>
+      </w:r>
+      <w:r>
+        <w:t xml:space="preserve">min-max). The advancements documented in this paper are a</w:t>
+      </w:r>
+      <w:r>
+        <w:t xml:space="preserve"> </w:t>
+      </w:r>
+      <w:r>
+        <w:rPr>
+          <w:b/>
+          <w:bCs/>
+        </w:rPr>
+        <w:t xml:space="preserve">proposal</w:t>
+      </w:r>
+      <w:r>
+        <w:t xml:space="preserve">; once validated (</w:t>
+      </w:r>
+      <w:r>
+        <w:t xml:space="preserve">“when it</w:t>
+      </w:r>
+      <w:r>
+        <w:t xml:space="preserve"> </w:t>
+      </w:r>
+      <w:r>
+        <w:t xml:space="preserve">passes”</w:t>
+      </w:r>
+      <w:r>
+        <w:t xml:space="preserve">) they are implemented as</w:t>
+      </w:r>
+      <w:r>
+        <w:t xml:space="preserve"> </w:t>
+      </w:r>
+      <w:r>
+        <w:rPr>
+          <w:b/>
+          <w:bCs/>
+        </w:rPr>
+        <w:t xml:space="preserve">INFORM Calc Engine v2</w:t>
+      </w:r>
+      <w:r>
+        <w:t xml:space="preserve">. In short:</w:t>
+      </w:r>
+      <w:r>
+        <w:t xml:space="preserve"> </w:t>
+      </w:r>
+      <w:r>
+        <w:rPr>
+          <w:b/>
+          <w:bCs/>
+        </w:rPr>
+        <w:t xml:space="preserve">v1 = exact INFORM now; v2 =</w:t>
+      </w:r>
+      <w:r>
+        <w:rPr>
+          <w:b/>
+          <w:bCs/>
+        </w:rPr>
+        <w:t xml:space="preserve"> </w:t>
+      </w:r>
+      <w:r>
+        <w:rPr>
+          <w:b/>
+          <w:bCs/>
+        </w:rPr>
+        <w:t xml:space="preserve">these advancements next</w:t>
+      </w:r>
+      <w:r>
+        <w:t xml:space="preserve">. This is one of three documents - (1) the operational</w:t>
+      </w:r>
+      <w:r>
+        <w:t xml:space="preserve"> </w:t>
+      </w:r>
+      <w:r>
+        <w:rPr>
+          <w:b/>
+          <w:bCs/>
+        </w:rPr>
+        <w:t xml:space="preserve">Manual</w:t>
+      </w:r>
+      <w:r>
+        <w:t xml:space="preserve">, (2) the</w:t>
+      </w:r>
+      <w:r>
+        <w:t xml:space="preserve"> </w:t>
+      </w:r>
+      <w:r>
+        <w:rPr>
+          <w:b/>
+          <w:bCs/>
+        </w:rPr>
+        <w:t xml:space="preserve">Exact-formula reference</w:t>
+      </w:r>
+      <w:r>
+        <w:t xml:space="preserve"> </w:t>
+      </w:r>
+      <w:r>
+        <w:t xml:space="preserve">(</w:t>
+      </w:r>
+      <w:r>
+        <w:rPr>
+          <w:rStyle w:val="VerbatimChar"/>
+        </w:rPr>
+        <w:t xml:space="preserve">INFORM_CALCULATION_ENGINE.docx</w:t>
+      </w:r>
+      <w:r>
+        <w:t xml:space="preserve">, what v1 runs), and (3) this</w:t>
+      </w:r>
+      <w:r>
+        <w:t xml:space="preserve"> </w:t>
+      </w:r>
+      <w:r>
+        <w:rPr>
+          <w:b/>
+          <w:bCs/>
+        </w:rPr>
+        <w:t xml:space="preserve">Paper</w:t>
+      </w:r>
+      <w:r>
+        <w:t xml:space="preserve"> </w:t>
+      </w:r>
+      <w:r>
+        <w:t xml:space="preserve">(the v2 proposal).</w:t>
+      </w:r>
+    </w:p>
+    <w:bookmarkStart w:id="9" w:name="abstract"/>
+    <w:p>
+      <w:pPr>
+        <w:pStyle w:val="Heading1"/>
+      </w:pPr>
+      <w:r>
+        <w:t xml:space="preserve">Abstract</w:t>
+      </w:r>
+    </w:p>
+    <w:p>
+      <w:pPr>
         <w:pStyle w:val="FirstParagraph"/>
       </w:pPr>
       <w:r>
-        <w:t xml:space="preserve">We reproduced a unit end-to-end against the workbook: for Kondoa, the workbook’s own Hazard dimension is</w:t>
-      </w:r>
-      <w:r>
-        <w:t xml:space="preserve"> </w:t>
-      </w:r>
-      <w:r>
-        <w:rPr>
-          <w:rStyle w:val="VerbatimChar"/>
-        </w:rPr>
-        <w:t xml:space="preserve">scaled-geomean(Natural 3.544, Human 0.683) = 2.2</w:t>
-      </w:r>
-      <w:r>
-        <w:t xml:space="preserve">, and our implementation returns the same 2.2 for the</w:t>
-      </w:r>
-      <w:r>
-        <w:t xml:space="preserve"> </w:t>
-      </w:r>
-      <w:r>
-        <w:t xml:space="preserve">same inputs; the national value matches the workbook to the decimal (Hazard 2.2, Vulnerability 5.5,</w:t>
-      </w:r>
-      <w:r>
-        <w:t xml:space="preserve"> </w:t>
-      </w:r>
-      <w:r>
-        <w:t xml:space="preserve">Lack-of-Coping 5.9, Risk 4.1). The engine is therefore</w:t>
-      </w:r>
-      <w:r>
-        <w:t xml:space="preserve"> </w:t>
-      </w:r>
-      <w:r>
-        <w:rPr>
-          <w:b/>
-          <w:bCs/>
-        </w:rPr>
-        <w:t xml:space="preserve">unchanged</w:t>
-      </w:r>
-      <w:r>
-        <w:t xml:space="preserve">; only indicator</w:t>
+        <w:t xml:space="preserve">The INFORM Subnational Risk Index aggregates standardised (0-10) hazard, vulnerability and lack-of-coping</w:t>
+      </w:r>
+      <w:r>
+        <w:t xml:space="preserve"> </w:t>
+      </w:r>
+      <w:r>
+        <w:t xml:space="preserve">indicators into a comparable risk score. Its aggregation</w:t>
+      </w:r>
+      <w:r>
+        <w:t xml:space="preserve"> </w:t>
+      </w:r>
+      <w:r>
+        <w:rPr>
+          <w:b/>
+          <w:bCs/>
+        </w:rPr>
+        <w:t xml:space="preserve">engine</w:t>
+      </w:r>
+      <w:r>
+        <w:t xml:space="preserve"> </w:t>
+      </w:r>
+      <w:r>
+        <w:t xml:space="preserve">- min-max standardisation (with</w:t>
+      </w:r>
+      <w:r>
+        <w:t xml:space="preserve"> </w:t>
+      </w:r>
+      <w:r>
+        <w:t xml:space="preserve">logarithmic transformation and Tukey outlier capping), arithmetic averaging of indicators into categories,</w:t>
+      </w:r>
+      <w:r>
+        <w:t xml:space="preserve"> </w:t>
+      </w:r>
+      <w:r>
+        <w:t xml:space="preserve">the</w:t>
+      </w:r>
+      <w:r>
+        <w:t xml:space="preserve"> </w:t>
+      </w:r>
+      <w:r>
+        <w:rPr>
+          <w:b/>
+          <w:bCs/>
+        </w:rPr>
+        <w:t xml:space="preserve">scaled geometric mean</w:t>
+      </w:r>
+      <w:r>
+        <w:t xml:space="preserve"> </w:t>
+      </w:r>
+      <w:r>
+        <w:t xml:space="preserve">of categories into dimensions, and the</w:t>
+      </w:r>
+      <w:r>
+        <w:t xml:space="preserve"> </w:t>
+      </w:r>
+      <w:r>
+        <w:rPr>
+          <w:b/>
+          <w:bCs/>
+        </w:rPr>
+        <w:t xml:space="preserve">cube root</w:t>
+      </w:r>
+      <w:r>
+        <w:t xml:space="preserve"> </w:t>
+      </w:r>
+      <w:r>
+        <w:t xml:space="preserve">of the three dimensions</w:t>
+      </w:r>
+      <w:r>
+        <w:t xml:space="preserve"> </w:t>
+      </w:r>
+      <w:r>
+        <w:t xml:space="preserve">into risk - is a fixed methodology we</w:t>
+      </w:r>
+      <w:r>
+        <w:t xml:space="preserve"> </w:t>
+      </w:r>
+      <w:r>
+        <w:rPr>
+          <w:b/>
+          <w:bCs/>
+        </w:rPr>
+        <w:t xml:space="preserve">preserve exactly</w:t>
+      </w:r>
+      <w:r>
+        <w:t xml:space="preserve"> </w:t>
+      </w:r>
+      <w:r>
+        <w:t xml:space="preserve">as implemented in the official</w:t>
       </w:r>
       <w:r>
         <w:t xml:space="preserve"> </w:t>
@@ -953,98 +662,200 @@
           <w:i/>
           <w:iCs/>
         </w:rPr>
-        <w:t xml:space="preserve">inputs</w:t>
-      </w:r>
-      <w:r>
-        <w:t xml:space="preserve"> </w:t>
-      </w:r>
-      <w:r>
-        <w:t xml:space="preserve">differ where</w:t>
-      </w:r>
-      <w:r>
-        <w:t xml:space="preserve"> </w:t>
-      </w:r>
-      <w:r>
-        <w:t xml:space="preserve">we advanced them. Two engine-level options the workbook supports but our recompute scripts do not yet apply</w:t>
-      </w:r>
-      <w:r>
-        <w:t xml:space="preserve"> </w:t>
-      </w:r>
-      <w:r>
-        <w:t xml:space="preserve">-</w:t>
-      </w:r>
-      <w:r>
-        <w:t xml:space="preserve"> </w:t>
-      </w:r>
-      <w:r>
-        <w:rPr>
-          <w:b/>
-          <w:bCs/>
-        </w:rPr>
-        <w:t xml:space="preserve">Tukey IQR capping</w:t>
-      </w:r>
-      <w:r>
-        <w:t xml:space="preserve"> </w:t>
-      </w:r>
-      <w:r>
-        <w:t xml:space="preserve">of recomputed series, and</w:t>
-      </w:r>
-      <w:r>
-        <w:t xml:space="preserve"> </w:t>
-      </w:r>
-      <w:r>
-        <w:rPr>
-          <w:b/>
-          <w:bCs/>
-        </w:rPr>
-        <w:t xml:space="preserve">custom (fixed) reference ranges</w:t>
-      </w:r>
-      <w:r>
-        <w:t xml:space="preserve"> </w:t>
-      </w:r>
-      <w:r>
-        <w:t xml:space="preserve">instead of the</w:t>
-      </w:r>
-      <w:r>
-        <w:t xml:space="preserve"> </w:t>
-      </w:r>
-      <w:r>
-        <w:t xml:space="preserve">Tanzania data range - are recorded as</w:t>
-      </w:r>
-      <w:r>
-        <w:t xml:space="preserve"> </w:t>
-      </w:r>
-      <w:r>
-        <w:rPr>
-          <w:b/>
-          <w:bCs/>
-        </w:rPr>
-        <w:t xml:space="preserve">future work</w:t>
-      </w:r>
-      <w:r>
-        <w:t xml:space="preserve"> </w:t>
-      </w:r>
-      <w:r>
-        <w:t xml:space="preserve">(Section 7) and are not changed here.</w:t>
+        <w:t xml:space="preserve">Tanzania - Country Model Template</w:t>
+      </w:r>
+      <w:r>
+        <w:t xml:space="preserve"> </w:t>
+      </w:r>
+      <w:r>
+        <w:t xml:space="preserve">workbook (verified formula-by-formula from its hidden sheets). What we</w:t>
+      </w:r>
+      <w:r>
+        <w:t xml:space="preserve"> </w:t>
+      </w:r>
+      <w:r>
+        <w:rPr>
+          <w:b/>
+          <w:bCs/>
+        </w:rPr>
+        <w:t xml:space="preserve">advance</w:t>
+      </w:r>
+      <w:r>
+        <w:t xml:space="preserve"> </w:t>
+      </w:r>
+      <w:r>
+        <w:t xml:space="preserve">is the</w:t>
+      </w:r>
+      <w:r>
+        <w:t xml:space="preserve"> </w:t>
+      </w:r>
+      <w:r>
+        <w:rPr>
+          <w:i/>
+          <w:iCs/>
+        </w:rPr>
+        <w:t xml:space="preserve">evidence</w:t>
+      </w:r>
+      <w:r>
+        <w:t xml:space="preserve"> </w:t>
+      </w:r>
+      <w:r>
+        <w:t xml:space="preserve">behind individual hazard indicators where authoritative national data exist.</w:t>
+      </w:r>
+      <w:r>
+        <w:t xml:space="preserve"> </w:t>
+      </w:r>
+      <w:r>
+        <w:t xml:space="preserve">This paper documents the advancement of the</w:t>
+      </w:r>
+      <w:r>
+        <w:t xml:space="preserve"> </w:t>
+      </w:r>
+      <w:r>
+        <w:rPr>
+          <w:b/>
+          <w:bCs/>
+        </w:rPr>
+        <w:t xml:space="preserve">drought hazard</w:t>
+      </w:r>
+      <w:r>
+        <w:t xml:space="preserve"> </w:t>
+      </w:r>
+      <w:r>
+        <w:t xml:space="preserve">from a coarse INFORM SADC value to a</w:t>
+      </w:r>
+      <w:r>
+        <w:t xml:space="preserve"> </w:t>
+      </w:r>
+      <w:r>
+        <w:t xml:space="preserve">transparent four-component index computed from CHIRPS v3 rainfall (1991-2024) and ERA5 temperature -</w:t>
+      </w:r>
+      <w:r>
+        <w:t xml:space="preserve"> </w:t>
+      </w:r>
+      <w:r>
+        <w:t xml:space="preserve">aridity, interannual variability, SPEI drought depth, and growing-season failure - together with the</w:t>
+      </w:r>
+      <w:r>
+        <w:t xml:space="preserve"> </w:t>
+      </w:r>
+      <w:r>
+        <w:rPr>
+          <w:b/>
+          <w:bCs/>
+        </w:rPr>
+        <w:t xml:space="preserve">initial vs advanced</w:t>
+      </w:r>
+      <w:r>
+        <w:t xml:space="preserve"> </w:t>
+      </w:r>
+      <w:r>
+        <w:t xml:space="preserve">comparison, the</w:t>
+      </w:r>
+      <w:r>
+        <w:t xml:space="preserve"> </w:t>
+      </w:r>
+      <w:r>
+        <w:rPr>
+          <w:b/>
+          <w:bCs/>
+        </w:rPr>
+        <w:t xml:space="preserve">impact</w:t>
+      </w:r>
+      <w:r>
+        <w:t xml:space="preserve">, and the</w:t>
+      </w:r>
+      <w:r>
+        <w:t xml:space="preserve"> </w:t>
+      </w:r>
+      <w:r>
+        <w:rPr>
+          <w:b/>
+          <w:bCs/>
+        </w:rPr>
+        <w:t xml:space="preserve">gap</w:t>
+      </w:r>
+      <w:r>
+        <w:t xml:space="preserve"> </w:t>
+      </w:r>
+      <w:r>
+        <w:t xml:space="preserve">the advancement closes. We show the</w:t>
+      </w:r>
+      <w:r>
+        <w:t xml:space="preserve"> </w:t>
+      </w:r>
+      <w:r>
+        <w:t xml:space="preserve">initial drought layer was spatially incoherent (the central semi-arid zone under-rated at ~4/10, a coastal</w:t>
+      </w:r>
+      <w:r>
+        <w:t xml:space="preserve"> </w:t>
+      </w:r>
+      <w:r>
+        <w:t xml:space="preserve">city over-rated at 10/10), whereas the advanced layer tracks observed rainfall and the food-security</w:t>
+      </w:r>
+      <w:r>
+        <w:t xml:space="preserve"> </w:t>
+      </w:r>
+      <w:r>
+        <w:t xml:space="preserve">geography. The flood, heatwave and exposure advancements are summarised. Finally we open a</w:t>
+      </w:r>
+      <w:r>
+        <w:t xml:space="preserve"> </w:t>
+      </w:r>
+      <w:r>
+        <w:rPr>
+          <w:b/>
+          <w:bCs/>
+        </w:rPr>
+        <w:t xml:space="preserve">living, four-tier v2</w:t>
+      </w:r>
+      <w:r>
+        <w:rPr>
+          <w:b/>
+          <w:bCs/>
+        </w:rPr>
+        <w:t xml:space="preserve"> </w:t>
+      </w:r>
+      <w:r>
+        <w:rPr>
+          <w:b/>
+          <w:bCs/>
+        </w:rPr>
+        <w:t xml:space="preserve">issue register</w:t>
+      </w:r>
+      <w:r>
+        <w:t xml:space="preserve"> </w:t>
+      </w:r>
+      <w:r>
+        <w:t xml:space="preserve">(Section 8) - engine-fidelity, hazard-evidence, exposure/vulnerability resolution, and</w:t>
+      </w:r>
+      <w:r>
+        <w:t xml:space="preserve"> </w:t>
+      </w:r>
+      <w:r>
+        <w:t xml:space="preserve">validation - and the three cross-cutting insights (stable references, hazard-specific exposure, outcome</w:t>
+      </w:r>
+      <w:r>
+        <w:t xml:space="preserve"> </w:t>
+      </w:r>
+      <w:r>
+        <w:t xml:space="preserve">validation) that anchor it (Section 9). Every item is a proposal for a future, separately-validated INFORM</w:t>
+      </w:r>
+      <w:r>
+        <w:t xml:space="preserve"> </w:t>
+      </w:r>
+      <w:r>
+        <w:t xml:space="preserve">Calc Engine v2; none changes the v1 engine running today.</w:t>
       </w:r>
     </w:p>
-    <w:bookmarkEnd w:id="11"/>
-    <w:bookmarkStart w:id="15" w:name="the-drought-advancement---method"/>
+    <w:bookmarkEnd w:id="9"/>
+    <w:bookmarkStart w:id="10" w:name="introduction"/>
     <w:p>
       <w:pPr>
         <w:pStyle w:val="Heading1"/>
       </w:pPr>
       <w:r>
-        <w:t xml:space="preserve">3. The drought advancement - method</w:t>
-      </w:r>
-    </w:p>
-    <w:bookmarkStart w:id="12" w:name="Xe307caade9ebe20c6688050399fb63691effb5f"/>
-    <w:p>
-      <w:pPr>
-        <w:pStyle w:val="Heading2"/>
-      </w:pPr>
-      <w:r>
-        <w:t xml:space="preserve">3.1 Rationale and the gap in the initial layer</w:t>
+        <w:t xml:space="preserve">1. Introduction</w:t>
       </w:r>
     </w:p>
     <w:p>
@@ -1052,60 +863,13 @@
         <w:pStyle w:val="FirstParagraph"/>
       </w:pPr>
       <w:r>
-        <w:t xml:space="preserve">The initial INFORM SADC drought scores for Tanzania are spatially incoherent (Section 5, Table 2): several</w:t>
-      </w:r>
-      <w:r>
-        <w:t xml:space="preserve"> </w:t>
-      </w:r>
-      <w:r>
-        <w:t xml:space="preserve">central</w:t>
-      </w:r>
-      <w:r>
-        <w:t xml:space="preserve"> </w:t>
-      </w:r>
-      <w:r>
-        <w:rPr>
-          <w:b/>
-          <w:bCs/>
-        </w:rPr>
-        <w:t xml:space="preserve">semi-arid</w:t>
-      </w:r>
-      <w:r>
-        <w:t xml:space="preserve"> </w:t>
-      </w:r>
-      <w:r>
-        <w:t xml:space="preserve">councils (Kondoa 771 mm yr^-1, Singida 749 mm, Manyoni 760 mm) scored only 3.6-4.3/10,</w:t>
-      </w:r>
-      <w:r>
-        <w:t xml:space="preserve"> </w:t>
-      </w:r>
-      <w:r>
-        <w:t xml:space="preserve">while a wet coastal city (Dar es Salaam / Ilala, 1,253 mm) scored 10/10. Semi-arid central Tanzania is a</w:t>
-      </w:r>
-      <w:r>
-        <w:t xml:space="preserve"> </w:t>
-      </w:r>
-      <w:r>
-        <w:t xml:space="preserve">recurrent drought- and food-insecurity hotspot (IPC/MUCHALI classifications), so an index that rates it</w:t>
-      </w:r>
-      <w:r>
-        <w:t xml:space="preserve"> </w:t>
-      </w:r>
-      <w:r>
-        <w:t xml:space="preserve">below 5 while maxing out a coastal city is not credible. This is the</w:t>
-      </w:r>
-      <w:r>
-        <w:t xml:space="preserve"> </w:t>
-      </w:r>
-      <w:r>
-        <w:rPr>
-          <w:b/>
-          <w:bCs/>
-        </w:rPr>
-        <w:t xml:space="preserve">gap</w:t>
-      </w:r>
-      <w:r>
-        <w:t xml:space="preserve">: the</w:t>
+        <w:t xml:space="preserve">INFORM (the Index for Risk Management; DRMKC/JRC, European Commission) provides a transparent, reproducible</w:t>
+      </w:r>
+      <w:r>
+        <w:t xml:space="preserve"> </w:t>
+      </w:r>
+      <w:r>
+        <w:t xml:space="preserve">composite risk model [1]. For Tanzania, the operational instrument is the</w:t>
       </w:r>
       <w:r>
         <w:t xml:space="preserve"> </w:t>
@@ -1115,29 +879,41 @@
           <w:i/>
           <w:iCs/>
         </w:rPr>
-        <w:t xml:space="preserve">initial</w:t>
-      </w:r>
-      <w:r>
-        <w:t xml:space="preserve"> </w:t>
-      </w:r>
-      <w:r>
-        <w:t xml:space="preserve">relevance of the</w:t>
-      </w:r>
-      <w:r>
-        <w:t xml:space="preserve"> </w:t>
-      </w:r>
-      <w:r>
-        <w:t xml:space="preserve">drought layer was, in places, simply not true.</w:t>
+        <w:t xml:space="preserve">Tanzania - Country Model</w:t>
+      </w:r>
+      <w:r>
+        <w:rPr>
+          <w:i/>
+          <w:iCs/>
+        </w:rPr>
+        <w:t xml:space="preserve"> </w:t>
+      </w:r>
+      <w:r>
+        <w:rPr>
+          <w:i/>
+          <w:iCs/>
+        </w:rPr>
+        <w:t xml:space="preserve">Template</w:t>
+      </w:r>
+      <w:r>
+        <w:t xml:space="preserve"> </w:t>
+      </w:r>
+      <w:r>
+        <w:t xml:space="preserve">workbook, whose engine standardises each indicator to 0-10 and aggregates them. The engine is</w:t>
+      </w:r>
+      <w:r>
+        <w:t xml:space="preserve"> </w:t>
+      </w:r>
+      <w:r>
+        <w:t xml:space="preserve">deliberately conservative and globally comparable; it must not be silently altered.</w:t>
       </w:r>
     </w:p>
-    <w:bookmarkEnd w:id="12"/>
-    <w:bookmarkStart w:id="13" w:name="data"/>
     <w:p>
       <w:pPr>
-        <w:pStyle w:val="Heading2"/>
-      </w:pPr>
-      <w:r>
-        <w:t xml:space="preserve">3.2 Data</w:t>
+        <w:pStyle w:val="BodyText"/>
+      </w:pPr>
+      <w:r>
+        <w:t xml:space="preserve">Our work separates two concerns:</w:t>
       </w:r>
     </w:p>
     <w:p>
@@ -1153,19 +929,141 @@
           <w:b/>
           <w:bCs/>
         </w:rPr>
-        <w:t xml:space="preserve">CHIRPS v3</w:t>
-      </w:r>
-      <w:r>
-        <w:t xml:space="preserve"> </w:t>
-      </w:r>
-      <w:r>
-        <w:t xml:space="preserve">monthly precipitation, 0.05 deg, 1991-2024, the same product validated for Tanzanian</w:t>
-      </w:r>
-      <w:r>
-        <w:t xml:space="preserve"> </w:t>
-      </w:r>
-      <w:r>
-        <w:t xml:space="preserve">rainfall classification [2]. Zonal-mean rainfall is extracted per administrative unit.</w:t>
+        <w:t xml:space="preserve">The engine</w:t>
+      </w:r>
+      <w:r>
+        <w:t xml:space="preserve"> </w:t>
+      </w:r>
+      <w:r>
+        <w:t xml:space="preserve">(how numbers combine). This stays</w:t>
+      </w:r>
+      <w:r>
+        <w:t xml:space="preserve"> </w:t>
+      </w:r>
+      <w:r>
+        <w:rPr>
+          <w:b/>
+          <w:bCs/>
+        </w:rPr>
+        <w:t xml:space="preserve">identical</w:t>
+      </w:r>
+      <w:r>
+        <w:t xml:space="preserve"> </w:t>
+      </w:r>
+      <w:r>
+        <w:t xml:space="preserve">to the workbook - we verified every</w:t>
+      </w:r>
+      <w:r>
+        <w:t xml:space="preserve"> </w:t>
+      </w:r>
+      <w:r>
+        <w:t xml:space="preserve">formula directly from the (hidden) engine sheets (see the companion</w:t>
+      </w:r>
+      <w:r>
+        <w:t xml:space="preserve"> </w:t>
+      </w:r>
+      <w:r>
+        <w:rPr>
+          <w:rStyle w:val="VerbatimChar"/>
+        </w:rPr>
+        <w:t xml:space="preserve">INFORM_CALCULATION_ENGINE.docx</w:t>
+      </w:r>
+      <w:r>
+        <w:t xml:space="preserve">):</w:t>
+      </w:r>
+      <w:r>
+        <w:t xml:space="preserve"> </w:t>
+      </w:r>
+      <w:r>
+        <w:t xml:space="preserve">component =</w:t>
+      </w:r>
+      <w:r>
+        <w:t xml:space="preserve"> </w:t>
+      </w:r>
+      <w:r>
+        <w:rPr>
+          <w:rStyle w:val="VerbatimChar"/>
+        </w:rPr>
+        <w:t xml:space="preserve">AVERAGE</w:t>
+      </w:r>
+      <w:r>
+        <w:t xml:space="preserve">, category =</w:t>
+      </w:r>
+      <w:r>
+        <w:t xml:space="preserve"> </w:t>
+      </w:r>
+      <w:r>
+        <w:rPr>
+          <w:rStyle w:val="VerbatimChar"/>
+        </w:rPr>
+        <w:t xml:space="preserve">AVERAGE</w:t>
+      </w:r>
+      <w:r>
+        <w:t xml:space="preserve">, dimension =</w:t>
+      </w:r>
+      <w:r>
+        <w:t xml:space="preserve"> </w:t>
+      </w:r>
+      <w:r>
+        <w:rPr>
+          <w:rStyle w:val="VerbatimChar"/>
+        </w:rPr>
+        <w:t xml:space="preserve">ROUND((10-GEOMEAN((10-c)/10*9+1...))/9*10,1)</w:t>
+      </w:r>
+      <w:r>
+        <w:t xml:space="preserve"> </w:t>
+      </w:r>
+      <w:r>
+        <w:t xml:space="preserve">(scaled geometric mean), risk =</w:t>
+      </w:r>
+      <w:r>
+        <w:t xml:space="preserve"> </w:t>
+      </w:r>
+      <w:r>
+        <w:rPr>
+          <w:rStyle w:val="VerbatimChar"/>
+        </w:rPr>
+        <w:t xml:space="preserve">ROUND(H^(1/3)*V^(1/3)*LCC^(1/3),1)</w:t>
+      </w:r>
+      <w:r>
+        <w:t xml:space="preserve"> </w:t>
+      </w:r>
+      <w:r>
+        <w:t xml:space="preserve">(cube root), and standardisation =</w:t>
+      </w:r>
+      <w:r>
+        <w:t xml:space="preserve"> </w:t>
+      </w:r>
+      <w:r>
+        <w:t xml:space="preserve">min-max to 0-10 with optional log/exp transform, Tukey (Q1-1.5</w:t>
+      </w:r>
+      <w:r>
+        <w:rPr>
+          <w:i/>
+          <w:iCs/>
+        </w:rPr>
+        <w:t xml:space="preserve">IQR, Q3+1.5</w:t>
+      </w:r>
+      <w:r>
+        <w:t xml:space="preserve">IQR) outlier capping, and an</w:t>
+      </w:r>
+      <w:r>
+        <w:t xml:space="preserve"> </w:t>
+      </w:r>
+      <w:r>
+        <w:t xml:space="preserve">inversion for</w:t>
+      </w:r>
+      <w:r>
+        <w:t xml:space="preserve"> </w:t>
+      </w:r>
+      <w:r>
+        <w:t xml:space="preserve">“Decrease Risk”</w:t>
+      </w:r>
+      <w:r>
+        <w:t xml:space="preserve"> </w:t>
+      </w:r>
+      <w:r>
+        <w:t xml:space="preserve">indicators.</w:t>
       </w:r>
     </w:p>
     <w:p>
@@ -1181,13 +1079,395 @@
           <w:b/>
           <w:bCs/>
         </w:rPr>
-        <w:t xml:space="preserve">CHIRPS v3 daily</w:t>
-      </w:r>
-      <w:r>
-        <w:t xml:space="preserve"> </w:t>
-      </w:r>
-      <w:r>
-        <w:t xml:space="preserve">(2015-2024) for the companion heavy-rain/flood layer (Section 6).</w:t>
+        <w:t xml:space="preserve">The evidence</w:t>
+      </w:r>
+      <w:r>
+        <w:t xml:space="preserve"> </w:t>
+      </w:r>
+      <w:r>
+        <w:t xml:space="preserve">(the value of each indicator). Where the INFORM SADC layer is coarse, dated, or</w:t>
+      </w:r>
+      <w:r>
+        <w:t xml:space="preserve"> </w:t>
+      </w:r>
+      <w:r>
+        <w:t xml:space="preserve">incoherent for Tanzania, and authoritative national data exist, we</w:t>
+      </w:r>
+      <w:r>
+        <w:t xml:space="preserve"> </w:t>
+      </w:r>
+      <w:r>
+        <w:rPr>
+          <w:b/>
+          <w:bCs/>
+        </w:rPr>
+        <w:t xml:space="preserve">recompute the indicator</w:t>
+      </w:r>
+      <w:r>
+        <w:t xml:space="preserve"> </w:t>
+      </w:r>
+      <w:r>
+        <w:t xml:space="preserve">from</w:t>
+      </w:r>
+      <w:r>
+        <w:t xml:space="preserve"> </w:t>
+      </w:r>
+      <w:r>
+        <w:t xml:space="preserve">primary data using the</w:t>
+      </w:r>
+      <w:r>
+        <w:t xml:space="preserve"> </w:t>
+      </w:r>
+      <w:r>
+        <w:rPr>
+          <w:b/>
+          <w:bCs/>
+        </w:rPr>
+        <w:t xml:space="preserve">same standardisation method</w:t>
+      </w:r>
+      <w:r>
+        <w:t xml:space="preserve"> </w:t>
+      </w:r>
+      <w:r>
+        <w:t xml:space="preserve">the engine prescribes, and we apply it</w:t>
+      </w:r>
+      <w:r>
+        <w:t xml:space="preserve"> </w:t>
+      </w:r>
+      <w:r>
+        <w:rPr>
+          <w:b/>
+          <w:bCs/>
+        </w:rPr>
+        <w:t xml:space="preserve">raise-only</w:t>
+      </w:r>
+      <w:r>
+        <w:t xml:space="preserve"> </w:t>
+      </w:r>
+      <w:r>
+        <w:t xml:space="preserve">(the computed value may raise a documented hazard but never silently lower it).</w:t>
+      </w:r>
+      <w:r>
+        <w:t xml:space="preserve"> </w:t>
+      </w:r>
+      <w:r>
+        <w:rPr>
+          <w:i/>
+          <w:iCs/>
+        </w:rPr>
+        <w:t xml:space="preserve">[Withdrawn October 2026: evidence enters the separate Advancement layer; the Core is never raised or lowered.]</w:t>
+      </w:r>
+    </w:p>
+    <w:p>
+      <w:pPr>
+        <w:pStyle w:val="FirstParagraph"/>
+      </w:pPr>
+      <w:r>
+        <w:t xml:space="preserve">This paper makes the second concern explicit and auditable, using</w:t>
+      </w:r>
+      <w:r>
+        <w:t xml:space="preserve"> </w:t>
+      </w:r>
+      <w:r>
+        <w:rPr>
+          <w:b/>
+          <w:bCs/>
+        </w:rPr>
+        <w:t xml:space="preserve">drought</w:t>
+      </w:r>
+      <w:r>
+        <w:t xml:space="preserve"> </w:t>
+      </w:r>
+      <w:r>
+        <w:t xml:space="preserve">as the worked case, because</w:t>
+      </w:r>
+      <w:r>
+        <w:t xml:space="preserve"> </w:t>
+      </w:r>
+      <w:r>
+        <w:t xml:space="preserve">drought is the hazard most consequential for Tanzanian food security and the one for which the densest</w:t>
+      </w:r>
+      <w:r>
+        <w:t xml:space="preserve"> </w:t>
+      </w:r>
+      <w:r>
+        <w:t xml:space="preserve">observational record exists.</w:t>
+      </w:r>
+    </w:p>
+    <w:bookmarkEnd w:id="10"/>
+    <w:bookmarkStart w:id="11" w:name="the-preserved-inform-engine"/>
+    <w:p>
+      <w:pPr>
+        <w:pStyle w:val="Heading1"/>
+      </w:pPr>
+      <w:r>
+        <w:t xml:space="preserve">2. The preserved INFORM engine</w:t>
+      </w:r>
+    </w:p>
+    <w:p>
+      <w:pPr>
+        <w:pStyle w:val="FirstParagraph"/>
+      </w:pPr>
+      <w:r>
+        <w:t xml:space="preserve">We reproduced a unit end-to-end against the workbook: for Kondoa, the workbook’s own Hazard dimension is</w:t>
+      </w:r>
+      <w:r>
+        <w:t xml:space="preserve"> </w:t>
+      </w:r>
+      <w:r>
+        <w:rPr>
+          <w:rStyle w:val="VerbatimChar"/>
+        </w:rPr>
+        <w:t xml:space="preserve">scaled-geomean(Natural 3.544, Human 0.683) = 2.2</w:t>
+      </w:r>
+      <w:r>
+        <w:t xml:space="preserve">, and our implementation returns the same 2.2 for the</w:t>
+      </w:r>
+      <w:r>
+        <w:t xml:space="preserve"> </w:t>
+      </w:r>
+      <w:r>
+        <w:t xml:space="preserve">same inputs; the figures we quoted as national (Hazard 2.2, Vulnerability 5.5, Lack-of-Coping 5.9,</w:t>
+      </w:r>
+      <w:r>
+        <w:t xml:space="preserve"> </w:t>
+      </w:r>
+      <w:r>
+        <w:t xml:space="preserve">Risk 4.1)</w:t>
+      </w:r>
+      <w:r>
+        <w:t xml:space="preserve"> </w:t>
+      </w:r>
+      <w:r>
+        <w:rPr>
+          <w:i/>
+          <w:iCs/>
+        </w:rPr>
+        <w:t xml:space="preserve">[are Kondoa’s row, not a national value; corrected October 2026: the INFORM aggregate of the</w:t>
+      </w:r>
+      <w:r>
+        <w:rPr>
+          <w:i/>
+          <w:iCs/>
+        </w:rPr>
+        <w:t xml:space="preserve"> </w:t>
+      </w:r>
+      <w:r>
+        <w:rPr>
+          <w:i/>
+          <w:iCs/>
+        </w:rPr>
+        <w:t xml:space="preserve">195 councils is 3.8 (2.4, 3.8, 6.2)]</w:t>
+      </w:r>
+      <w:r>
+        <w:t xml:space="preserve">. The engine is therefore</w:t>
+      </w:r>
+      <w:r>
+        <w:t xml:space="preserve"> </w:t>
+      </w:r>
+      <w:r>
+        <w:rPr>
+          <w:b/>
+          <w:bCs/>
+        </w:rPr>
+        <w:t xml:space="preserve">unchanged</w:t>
+      </w:r>
+      <w:r>
+        <w:t xml:space="preserve">; only indicator</w:t>
+      </w:r>
+      <w:r>
+        <w:t xml:space="preserve"> </w:t>
+      </w:r>
+      <w:r>
+        <w:rPr>
+          <w:i/>
+          <w:iCs/>
+        </w:rPr>
+        <w:t xml:space="preserve">inputs</w:t>
+      </w:r>
+      <w:r>
+        <w:t xml:space="preserve"> </w:t>
+      </w:r>
+      <w:r>
+        <w:t xml:space="preserve">differed where</w:t>
+      </w:r>
+      <w:r>
+        <w:t xml:space="preserve"> </w:t>
+      </w:r>
+      <w:r>
+        <w:t xml:space="preserve">we advanced them. Two engine-level options the workbook supports but our recompute scripts do not yet apply</w:t>
+      </w:r>
+      <w:r>
+        <w:t xml:space="preserve"> </w:t>
+      </w:r>
+      <w:r>
+        <w:t xml:space="preserve">-</w:t>
+      </w:r>
+      <w:r>
+        <w:t xml:space="preserve"> </w:t>
+      </w:r>
+      <w:r>
+        <w:rPr>
+          <w:b/>
+          <w:bCs/>
+        </w:rPr>
+        <w:t xml:space="preserve">Tukey IQR capping</w:t>
+      </w:r>
+      <w:r>
+        <w:t xml:space="preserve"> </w:t>
+      </w:r>
+      <w:r>
+        <w:t xml:space="preserve">of recomputed series, and</w:t>
+      </w:r>
+      <w:r>
+        <w:t xml:space="preserve"> </w:t>
+      </w:r>
+      <w:r>
+        <w:rPr>
+          <w:b/>
+          <w:bCs/>
+        </w:rPr>
+        <w:t xml:space="preserve">custom (fixed) reference ranges</w:t>
+      </w:r>
+      <w:r>
+        <w:t xml:space="preserve"> </w:t>
+      </w:r>
+      <w:r>
+        <w:t xml:space="preserve">instead of the</w:t>
+      </w:r>
+      <w:r>
+        <w:t xml:space="preserve"> </w:t>
+      </w:r>
+      <w:r>
+        <w:t xml:space="preserve">Tanzania data range - are recorded as</w:t>
+      </w:r>
+      <w:r>
+        <w:t xml:space="preserve"> </w:t>
+      </w:r>
+      <w:r>
+        <w:rPr>
+          <w:b/>
+          <w:bCs/>
+        </w:rPr>
+        <w:t xml:space="preserve">future work</w:t>
+      </w:r>
+      <w:r>
+        <w:t xml:space="preserve"> </w:t>
+      </w:r>
+      <w:r>
+        <w:t xml:space="preserve">(Section 7) and are not changed here.</w:t>
+      </w:r>
+    </w:p>
+    <w:bookmarkEnd w:id="11"/>
+    <w:bookmarkStart w:id="15" w:name="the-drought-advancement---method"/>
+    <w:p>
+      <w:pPr>
+        <w:pStyle w:val="Heading1"/>
+      </w:pPr>
+      <w:r>
+        <w:t xml:space="preserve">3. The drought advancement - method</w:t>
+      </w:r>
+    </w:p>
+    <w:bookmarkStart w:id="12" w:name="Xe307caade9ebe20c6688050399fb63691effb5f"/>
+    <w:p>
+      <w:pPr>
+        <w:pStyle w:val="Heading2"/>
+      </w:pPr>
+      <w:r>
+        <w:t xml:space="preserve">3.1 Rationale and the gap in the initial layer</w:t>
+      </w:r>
+    </w:p>
+    <w:p>
+      <w:pPr>
+        <w:pStyle w:val="FirstParagraph"/>
+      </w:pPr>
+      <w:r>
+        <w:t xml:space="preserve">The initial INFORM SADC drought scores for Tanzania are spatially incoherent (Section 5, Table 2): several</w:t>
+      </w:r>
+      <w:r>
+        <w:t xml:space="preserve"> </w:t>
+      </w:r>
+      <w:r>
+        <w:t xml:space="preserve">central</w:t>
+      </w:r>
+      <w:r>
+        <w:t xml:space="preserve"> </w:t>
+      </w:r>
+      <w:r>
+        <w:rPr>
+          <w:b/>
+          <w:bCs/>
+        </w:rPr>
+        <w:t xml:space="preserve">semi-arid</w:t>
+      </w:r>
+      <w:r>
+        <w:t xml:space="preserve"> </w:t>
+      </w:r>
+      <w:r>
+        <w:t xml:space="preserve">councils (Kondoa 771 mm yr^-1, Singida 749 mm, Manyoni 760 mm) scored only 3.6-4.3/10,</w:t>
+      </w:r>
+      <w:r>
+        <w:t xml:space="preserve"> </w:t>
+      </w:r>
+      <w:r>
+        <w:t xml:space="preserve">while a wet coastal city (Dar es Salaam / Ilala, 1,253 mm) scored 10/10. Semi-arid central Tanzania is a</w:t>
+      </w:r>
+      <w:r>
+        <w:t xml:space="preserve"> </w:t>
+      </w:r>
+      <w:r>
+        <w:t xml:space="preserve">recurrent drought- and food-insecurity hotspot (IPC/MUCHALI classifications), so an index that rates it</w:t>
+      </w:r>
+      <w:r>
+        <w:t xml:space="preserve"> </w:t>
+      </w:r>
+      <w:r>
+        <w:t xml:space="preserve">below 5 while maxing out a coastal city is not credible. This is the</w:t>
+      </w:r>
+      <w:r>
+        <w:t xml:space="preserve"> </w:t>
+      </w:r>
+      <w:r>
+        <w:rPr>
+          <w:b/>
+          <w:bCs/>
+        </w:rPr>
+        <w:t xml:space="preserve">gap</w:t>
+      </w:r>
+      <w:r>
+        <w:t xml:space="preserve">: the</w:t>
+      </w:r>
+      <w:r>
+        <w:t xml:space="preserve"> </w:t>
+      </w:r>
+      <w:r>
+        <w:rPr>
+          <w:i/>
+          <w:iCs/>
+        </w:rPr>
+        <w:t xml:space="preserve">initial</w:t>
+      </w:r>
+      <w:r>
+        <w:t xml:space="preserve"> </w:t>
+      </w:r>
+      <w:r>
+        <w:t xml:space="preserve">relevance of the</w:t>
+      </w:r>
+      <w:r>
+        <w:t xml:space="preserve"> </w:t>
+      </w:r>
+      <w:r>
+        <w:t xml:space="preserve">drought layer was, in places, simply not true.</w:t>
+      </w:r>
+    </w:p>
+    <w:bookmarkEnd w:id="12"/>
+    <w:bookmarkStart w:id="13" w:name="data"/>
+    <w:p>
+      <w:pPr>
+        <w:pStyle w:val="Heading2"/>
+      </w:pPr>
+      <w:r>
+        <w:t xml:space="preserve">3.2 Data</w:t>
       </w:r>
     </w:p>
     <w:p>
@@ -1195,7 +1475,57 @@
         <w:pStyle w:val="Compact"/>
         <w:numPr>
           <w:ilvl w:val="0"/>
-          <w:numId w:val="1002"/>
+          <w:numId w:val="1003"/>
+        </w:numPr>
+      </w:pPr>
+      <w:r>
+        <w:rPr>
+          <w:b/>
+          <w:bCs/>
+        </w:rPr>
+        <w:t xml:space="preserve">CHIRPS v3</w:t>
+      </w:r>
+      <w:r>
+        <w:t xml:space="preserve"> </w:t>
+      </w:r>
+      <w:r>
+        <w:t xml:space="preserve">monthly precipitation, 0.05 deg, 1991-2024, the same product validated for Tanzanian</w:t>
+      </w:r>
+      <w:r>
+        <w:t xml:space="preserve"> </w:t>
+      </w:r>
+      <w:r>
+        <w:t xml:space="preserve">rainfall classification [2]. Zonal-mean rainfall is extracted per administrative unit.</w:t>
+      </w:r>
+    </w:p>
+    <w:p>
+      <w:pPr>
+        <w:pStyle w:val="Compact"/>
+        <w:numPr>
+          <w:ilvl w:val="0"/>
+          <w:numId w:val="1003"/>
+        </w:numPr>
+      </w:pPr>
+      <w:r>
+        <w:rPr>
+          <w:b/>
+          <w:bCs/>
+        </w:rPr>
+        <w:t xml:space="preserve">CHIRPS v3 daily</w:t>
+      </w:r>
+      <w:r>
+        <w:t xml:space="preserve"> </w:t>
+      </w:r>
+      <w:r>
+        <w:t xml:space="preserve">(2015-2024) for the companion heavy-rain/flood layer (Section 6).</w:t>
+      </w:r>
+    </w:p>
+    <w:p>
+      <w:pPr>
+        <w:pStyle w:val="Compact"/>
+        <w:numPr>
+          <w:ilvl w:val="0"/>
+          <w:numId w:val="1003"/>
         </w:numPr>
       </w:pPr>
       <w:r>
@@ -1663,6 +1993,16 @@
       </w:r>
       <w:r>
         <w:t xml:space="preserve">advanced value replaces the initial only where it is higher, so no documented drought area is downgraded).</w:t>
+      </w:r>
+      <w:r>
+        <w:t xml:space="preserve"> </w:t>
+      </w:r>
+      <w:r>
+        <w:rPr>
+          <w:i/>
+          <w:iCs/>
+        </w:rPr>
+        <w:t xml:space="preserve">[Withdrawn October 2026: the blend and the floor are out of the model; the members enter the Advancement layer separately and the season-failure member is withheld.]</w:t>
       </w:r>
     </w:p>
     <w:p>
@@ -2868,6 +3208,58 @@
       <w:r>
         <w:t xml:space="preserve">outcome.</w:t>
       </w:r>
+      <w:r>
+        <w:t xml:space="preserve"> </w:t>
+      </w:r>
+      <w:r>
+        <w:rPr>
+          <w:i/>
+          <w:iCs/>
+        </w:rPr>
+        <w:t xml:space="preserve">[October 2026: the</w:t>
+      </w:r>
+      <w:r>
+        <w:rPr>
+          <w:i/>
+          <w:iCs/>
+        </w:rPr>
+        <w:t xml:space="preserve"> </w:t>
+      </w:r>
+      <w:r>
+        <w:rPr>
+          <w:i/>
+          <w:iCs/>
+        </w:rPr>
+        <w:t xml:space="preserve">“initial”</w:t>
+      </w:r>
+      <w:r>
+        <w:rPr>
+          <w:i/>
+          <w:iCs/>
+        </w:rPr>
+        <w:t xml:space="preserve"> </w:t>
+      </w:r>
+      <w:r>
+        <w:rPr>
+          <w:i/>
+          <w:iCs/>
+        </w:rPr>
+        <w:t xml:space="preserve">column of this table was the adjusted dataset, not the workbook; in</w:t>
+      </w:r>
+      <w:r>
+        <w:rPr>
+          <w:i/>
+          <w:iCs/>
+        </w:rPr>
+        <w:t xml:space="preserve"> </w:t>
+      </w:r>
+      <w:r>
+        <w:rPr>
+          <w:i/>
+          <w:iCs/>
+        </w:rPr>
+        <w:t xml:space="preserve">the workbook Ilala’s drought is the historic-frequency indicator like every other unit.]</w:t>
+      </w:r>
     </w:p>
     <w:p>
       <w:pPr>
@@ -2951,13 +3343,23 @@
       <w:r>
         <w:t xml:space="preserve">discipline was applied to:</w:t>
       </w:r>
+      <w:r>
+        <w:t xml:space="preserve"> </w:t>
+      </w:r>
+      <w:r>
+        <w:rPr>
+          <w:i/>
+          <w:iCs/>
+        </w:rPr>
+        <w:t xml:space="preserve">[All withdrawn from the Core in October 2026; see Status.]</w:t>
+      </w:r>
     </w:p>
     <w:p>
       <w:pPr>
         <w:pStyle w:val="Compact"/>
         <w:numPr>
           <w:ilvl w:val="0"/>
-          <w:numId w:val="1003"/>
+          <w:numId w:val="1004"/>
         </w:numPr>
       </w:pPr>
       <w:r>
@@ -3052,7 +3454,7 @@
         <w:pStyle w:val="Compact"/>
         <w:numPr>
           <w:ilvl w:val="0"/>
-          <w:numId w:val="1003"/>
+          <w:numId w:val="1004"/>
         </w:numPr>
       </w:pPr>
       <w:r>
@@ -3096,7 +3498,7 @@
         <w:pStyle w:val="Compact"/>
         <w:numPr>
           <w:ilvl w:val="0"/>
-          <w:numId w:val="1003"/>
+          <w:numId w:val="1004"/>
         </w:numPr>
       </w:pPr>
       <w:r>
@@ -3276,7 +3678,20 @@
         <w:t xml:space="preserve"> </w:t>
       </w:r>
       <w:r>
-        <w:t xml:space="preserve">raise-only. Because risk is a cube root of three dimensions, a drought rise of several points lifts the</w:t>
+        <w:t xml:space="preserve">raise-only</w:t>
+      </w:r>
+      <w:r>
+        <w:t xml:space="preserve"> </w:t>
+      </w:r>
+      <w:r>
+        <w:rPr>
+          <w:i/>
+          <w:iCs/>
+        </w:rPr>
+        <w:t xml:space="preserve">[no longer: the Core is the workbook; the Advancement layer is shown beside it]</w:t>
+      </w:r>
+      <w:r>
+        <w:t xml:space="preserve">. Because risk is a cube root of three dimensions, a drought rise of several points lifts the</w:t>
       </w:r>
       <w:r>
         <w:t xml:space="preserve"> </w:t>
@@ -3366,6 +3781,30 @@
       </w:r>
       <w:r>
         <w:t xml:space="preserve">case is handled separately as a documented correction.</w:t>
+      </w:r>
+      <w:r>
+        <w:t xml:space="preserve"> </w:t>
+      </w:r>
+      <w:r>
+        <w:rPr>
+          <w:i/>
+          <w:iCs/>
+        </w:rPr>
+        <w:t xml:space="preserve">[October 2026: moot; the Core is the workbook and</w:t>
+      </w:r>
+      <w:r>
+        <w:rPr>
+          <w:i/>
+          <w:iCs/>
+        </w:rPr>
+        <w:t xml:space="preserve"> </w:t>
+      </w:r>
+      <w:r>
+        <w:rPr>
+          <w:i/>
+          <w:iCs/>
+        </w:rPr>
+        <w:t xml:space="preserve">the Advancement layer is shown beside it.]</w:t>
       </w:r>
     </w:p>
     <w:bookmarkEnd w:id="19"/>
@@ -4668,6 +5107,16 @@
         <w:t xml:space="preserve">raise-only</w:t>
       </w:r>
       <w:r>
+        <w:t xml:space="preserve"> </w:t>
+      </w:r>
+      <w:r>
+        <w:rPr>
+          <w:i/>
+          <w:iCs/>
+        </w:rPr>
+        <w:t xml:space="preserve">[October 2026: as members of the Advancement layer, never as floors on the Core]</w:t>
+      </w:r>
+      <w:r>
         <w:t xml:space="preserve">:</w:t>
       </w:r>
     </w:p>
@@ -5958,7 +6407,7 @@
         <w:pStyle w:val="Compact"/>
         <w:numPr>
           <w:ilvl w:val="0"/>
-          <w:numId w:val="1004"/>
+          <w:numId w:val="1005"/>
         </w:numPr>
       </w:pPr>
       <w:r>
@@ -5986,7 +6435,7 @@
         <w:pStyle w:val="Compact"/>
         <w:numPr>
           <w:ilvl w:val="0"/>
-          <w:numId w:val="1004"/>
+          <w:numId w:val="1005"/>
         </w:numPr>
       </w:pPr>
       <w:r>
@@ -6007,6 +6456,30 @@
       </w:r>
       <w:r>
         <w:t xml:space="preserve">artifact), which is handled separately as a Data-Entry correction, not an advancement.</w:t>
+      </w:r>
+      <w:r>
+        <w:t xml:space="preserve"> </w:t>
+      </w:r>
+      <w:r>
+        <w:rPr>
+          <w:i/>
+          <w:iCs/>
+        </w:rPr>
+        <w:t xml:space="preserve">[Resolved by</w:t>
+      </w:r>
+      <w:r>
+        <w:rPr>
+          <w:i/>
+          <w:iCs/>
+        </w:rPr>
+        <w:t xml:space="preserve"> </w:t>
+      </w:r>
+      <w:r>
+        <w:rPr>
+          <w:i/>
+          <w:iCs/>
+        </w:rPr>
+        <w:t xml:space="preserve">withdrawing the rule: the Core is the workbook and the Advancement layer is shown beside it.]</w:t>
       </w:r>
     </w:p>
     <w:p>
@@ -6014,7 +6487,7 @@
         <w:pStyle w:val="Compact"/>
         <w:numPr>
           <w:ilvl w:val="0"/>
-          <w:numId w:val="1004"/>
+          <w:numId w:val="1005"/>
         </w:numPr>
       </w:pPr>
       <w:r>
@@ -6042,7 +6515,7 @@
         <w:pStyle w:val="Compact"/>
         <w:numPr>
           <w:ilvl w:val="0"/>
-          <w:numId w:val="1004"/>
+          <w:numId w:val="1005"/>
         </w:numPr>
       </w:pPr>
       <w:r>
@@ -6828,12 +7301,42 @@
     </w:lvlOverride>
   </w:num>
   <w:num w:numId="1002">
-    <w:abstractNumId w:val="991"/>
+    <w:abstractNumId w:val="99411"/>
+    <w:lvlOverride w:ilvl="0">
+      <w:startOverride w:val="1"/>
+    </w:lvlOverride>
+    <w:lvlOverride w:ilvl="1">
+      <w:startOverride w:val="1"/>
+    </w:lvlOverride>
+    <w:lvlOverride w:ilvl="2">
+      <w:startOverride w:val="1"/>
+    </w:lvlOverride>
+    <w:lvlOverride w:ilvl="3">
+      <w:startOverride w:val="1"/>
+    </w:lvlOverride>
+    <w:lvlOverride w:ilvl="4">
+      <w:startOverride w:val="1"/>
+    </w:lvlOverride>
+    <w:lvlOverride w:ilvl="5">
+      <w:startOverride w:val="1"/>
+    </w:lvlOverride>
+    <w:lvlOverride w:ilvl="6">
+      <w:startOverride w:val="1"/>
+    </w:lvlOverride>
+    <w:lvlOverride w:ilvl="7">
+      <w:startOverride w:val="1"/>
+    </w:lvlOverride>
+    <w:lvlOverride w:ilvl="8">
+      <w:startOverride w:val="1"/>
+    </w:lvlOverride>
   </w:num>
   <w:num w:numId="1003">
     <w:abstractNumId w:val="991"/>
   </w:num>
   <w:num w:numId="1004">
+    <w:abstractNumId w:val="991"/>
+  </w:num>
+  <w:num w:numId="1005">
     <w:abstractNumId w:val="991"/>
   </w:num>
 </w:numbering>

</xml_diff>